<commit_message>
Fix forms and update skill in prompt
</commit_message>
<xml_diff>
--- a/RAG/Forms/docx/Fixed/Mau_1.1_–_Nghi_quyet__ca_biet__1011143252_2605081617.docx
+++ b/RAG/Forms/docx/Fixed/Mau_1.1_–_Nghi_quyet__ca_biet__1011143252_2605081617.docx
@@ -14,8 +14,8 @@
         <w:tblLook w:val="0000" w:firstRow="0" w:lastRow="0" w:firstColumn="0" w:lastColumn="0" w:noHBand="0" w:noVBand="0"/>
       </w:tblPr>
       <w:tblGrid>
-        <w:gridCol w:w="3542"/>
-        <w:gridCol w:w="5837"/>
+        <w:gridCol w:w="3840"/>
+        <w:gridCol w:w="5539"/>
       </w:tblGrid>
       <w:tr>
         <w:trPr>
@@ -23,7 +23,7 @@
         </w:trPr>
         <w:tc>
           <w:tcPr>
-            <w:tcW w:w="3542" w:type="dxa"/>
+            <w:tcW w:w="3840" w:type="dxa"/>
             <w:tcBorders>
               <w:left w:val="nil"/>
               <w:bottom w:val="nil"/>
@@ -99,7 +99,7 @@
                 <w:color w:val="000000"/>
                 <w:shd w:val="clear" w:color="auto" w:fill="auto"/>
               </w:rPr>
-              <w:pict w14:anchorId="71BA2EBB">
+              <w:pict w14:anchorId="760B824F">
                 <v:line id="_x0000_s2052" alt="" style="position:absolute;left:0;text-align:left;z-index:1;mso-wrap-edited:f;mso-width-percent:0;mso-height-percent:0;mso-width-percent:0;mso-height-percent:0" from="43.2pt,3.1pt" to="129.45pt,3.1pt">
                   <w10:wrap side="right"/>
                 </v:line>
@@ -154,7 +154,7 @@
         </w:tc>
         <w:tc>
           <w:tcPr>
-            <w:tcW w:w="5837" w:type="dxa"/>
+            <w:tcW w:w="5539" w:type="dxa"/>
             <w:tcBorders>
               <w:left w:val="nil"/>
               <w:bottom w:val="nil"/>
@@ -237,7 +237,7 @@
                 <w:color w:val="000000"/>
                 <w:shd w:val="clear" w:color="auto" w:fill="auto"/>
               </w:rPr>
-              <w:pict w14:anchorId="49D5EF42">
+              <w:pict w14:anchorId="13DE41C6">
                 <v:line id="_x0000_s2051" alt="" style="position:absolute;left:0;text-align:left;z-index:2;mso-wrap-edited:f;mso-width-percent:0;mso-height-percent:0;mso-width-percent:0;mso-height-percent:0" from="70.95pt,1.7pt" to="232.2pt,1.7pt">
                   <w10:wrap side="right"/>
                 </v:line>
@@ -437,7 +437,7 @@
           <w:noProof/>
           <w:color w:val="000000"/>
         </w:rPr>
-        <w:pict w14:anchorId="2D88AAF3">
+        <w:pict w14:anchorId="3A88A772">
           <v:line id="_x0000_s2050" alt="" style="position:absolute;left:0;text-align:left;z-index:3;mso-wrap-edited:f;mso-width-percent:0;mso-height-percent:0;mso-width-percent:0;mso-height-percent:0" from="196.2pt,3.7pt" to="270.45pt,3.7pt">
             <w10:wrap side="right"/>
           </v:line>
@@ -561,7 +561,21 @@
           <w:szCs w:val="28"/>
           <w:lang w:val="vi-VN" w:eastAsia="vi-VN"/>
         </w:rPr>
-        <w:t xml:space="preserve"> {{CAN_CU_PHAP_LY_1}}</w:t>
+        <w:t xml:space="preserve"> {{CAN_CU_PHAP_LY_1}</w:t>
+      </w:r>
+      <w:r>
+        <w:rPr>
+          <w:rStyle w:val="CharChar2"/>
+          <w:rFonts w:ascii="Times New Roman" w:hAnsi="Times New Roman"/>
+          <w:b w:val="0"/>
+          <w:i/>
+          <w:iCs/>
+          <w:color w:val="000000"/>
+          <w:sz w:val="28"/>
+          <w:szCs w:val="28"/>
+          <w:lang w:val="vi-VN" w:eastAsia="vi-VN"/>
+        </w:rPr>
+        <w:t>}</w:t>
       </w:r>
       <w:r>
         <w:rPr>
@@ -575,7 +589,7 @@
           <w:szCs w:val="28"/>
           <w:lang w:eastAsia="vi-VN"/>
         </w:rPr>
-        <w:t>.;</w:t>
+        <w:t>;</w:t>
       </w:r>
     </w:p>
     <w:p>
@@ -1393,7 +1407,7 @@
         <w:noProof/>
         <w:sz w:val="20"/>
       </w:rPr>
-      <w:pict w14:anchorId="6CDB5D90">
+      <w:pict w14:anchorId="18647824">
         <v:group id="_x0000_s1025" alt="" style="position:absolute;margin-left:232pt;margin-top:-230.35pt;width:2.1pt;height:467.7pt;rotation:270;z-index:1" coordorigin="15224,629" coordsize="42,9439">
           <v:line id="_x0000_s1026" alt="" style="position:absolute" from="15224,629" to="15224,10068" strokeweight=".5pt"/>
           <v:line id="_x0000_s1027" alt="" style="position:absolute" from="15266,629" to="15266,10068" strokeweight=".5pt"/>

</xml_diff>

<commit_message>
Update forms and skill in prompt
</commit_message>
<xml_diff>
--- a/RAG/Forms/docx/Fixed/Mau_1.1_–_Nghi_quyet__ca_biet__1011143252_2605081617.docx
+++ b/RAG/Forms/docx/Fixed/Mau_1.1_–_Nghi_quyet__ca_biet__1011143252_2605081617.docx
@@ -14,8 +14,8 @@
         <w:tblLook w:val="0000" w:firstRow="0" w:lastRow="0" w:firstColumn="0" w:lastColumn="0" w:noHBand="0" w:noVBand="0"/>
       </w:tblPr>
       <w:tblGrid>
-        <w:gridCol w:w="3542"/>
-        <w:gridCol w:w="5837"/>
+        <w:gridCol w:w="3840"/>
+        <w:gridCol w:w="5539"/>
       </w:tblGrid>
       <w:tr>
         <w:trPr>
@@ -23,7 +23,7 @@
         </w:trPr>
         <w:tc>
           <w:tcPr>
-            <w:tcW w:w="3542" w:type="dxa"/>
+            <w:tcW w:w="3840" w:type="dxa"/>
             <w:tcBorders>
               <w:left w:val="nil"/>
               <w:bottom w:val="nil"/>
@@ -99,7 +99,7 @@
                 <w:color w:val="000000"/>
                 <w:shd w:val="clear" w:color="auto" w:fill="auto"/>
               </w:rPr>
-              <w:pict w14:anchorId="71BA2EBB">
+              <w:pict w14:anchorId="760B824F">
                 <v:line id="_x0000_s2052" alt="" style="position:absolute;left:0;text-align:left;z-index:1;mso-wrap-edited:f;mso-width-percent:0;mso-height-percent:0;mso-width-percent:0;mso-height-percent:0" from="43.2pt,3.1pt" to="129.45pt,3.1pt">
                   <w10:wrap side="right"/>
                 </v:line>
@@ -154,7 +154,7 @@
         </w:tc>
         <w:tc>
           <w:tcPr>
-            <w:tcW w:w="5837" w:type="dxa"/>
+            <w:tcW w:w="5539" w:type="dxa"/>
             <w:tcBorders>
               <w:left w:val="nil"/>
               <w:bottom w:val="nil"/>
@@ -237,7 +237,7 @@
                 <w:color w:val="000000"/>
                 <w:shd w:val="clear" w:color="auto" w:fill="auto"/>
               </w:rPr>
-              <w:pict w14:anchorId="49D5EF42">
+              <w:pict w14:anchorId="13DE41C6">
                 <v:line id="_x0000_s2051" alt="" style="position:absolute;left:0;text-align:left;z-index:2;mso-wrap-edited:f;mso-width-percent:0;mso-height-percent:0;mso-width-percent:0;mso-height-percent:0" from="70.95pt,1.7pt" to="232.2pt,1.7pt">
                   <w10:wrap side="right"/>
                 </v:line>
@@ -437,7 +437,7 @@
           <w:noProof/>
           <w:color w:val="000000"/>
         </w:rPr>
-        <w:pict w14:anchorId="2D88AAF3">
+        <w:pict w14:anchorId="3A88A772">
           <v:line id="_x0000_s2050" alt="" style="position:absolute;left:0;text-align:left;z-index:3;mso-wrap-edited:f;mso-width-percent:0;mso-height-percent:0;mso-width-percent:0;mso-height-percent:0" from="196.2pt,3.7pt" to="270.45pt,3.7pt">
             <w10:wrap side="right"/>
           </v:line>
@@ -561,7 +561,21 @@
           <w:szCs w:val="28"/>
           <w:lang w:val="vi-VN" w:eastAsia="vi-VN"/>
         </w:rPr>
-        <w:t xml:space="preserve"> {{CAN_CU_PHAP_LY_1}}</w:t>
+        <w:t xml:space="preserve"> {{CAN_CU_PHAP_LY_1}</w:t>
+      </w:r>
+      <w:r>
+        <w:rPr>
+          <w:rStyle w:val="CharChar2"/>
+          <w:rFonts w:ascii="Times New Roman" w:hAnsi="Times New Roman"/>
+          <w:b w:val="0"/>
+          <w:i/>
+          <w:iCs/>
+          <w:color w:val="000000"/>
+          <w:sz w:val="28"/>
+          <w:szCs w:val="28"/>
+          <w:lang w:val="vi-VN" w:eastAsia="vi-VN"/>
+        </w:rPr>
+        <w:t>}</w:t>
       </w:r>
       <w:r>
         <w:rPr>
@@ -575,7 +589,7 @@
           <w:szCs w:val="28"/>
           <w:lang w:eastAsia="vi-VN"/>
         </w:rPr>
-        <w:t>.;</w:t>
+        <w:t>;</w:t>
       </w:r>
     </w:p>
     <w:p>
@@ -1393,7 +1407,7 @@
         <w:noProof/>
         <w:sz w:val="20"/>
       </w:rPr>
-      <w:pict w14:anchorId="6CDB5D90">
+      <w:pict w14:anchorId="18647824">
         <v:group id="_x0000_s1025" alt="" style="position:absolute;margin-left:232pt;margin-top:-230.35pt;width:2.1pt;height:467.7pt;rotation:270;z-index:1" coordorigin="15224,629" coordsize="42,9439">
           <v:line id="_x0000_s1026" alt="" style="position:absolute" from="15224,629" to="15224,10068" strokeweight=".5pt"/>
           <v:line id="_x0000_s1027" alt="" style="position:absolute" from="15266,629" to="15266,10068" strokeweight=".5pt"/>

</xml_diff>